<commit_message>
Update docs and mobile sidebar navigation
</commit_message>
<xml_diff>
--- a/docs/Recruitment_Fraud_Detection_Graduation_Report.docx
+++ b/docs/Recruitment_Fraud_Detection_Graduation_Report.docx
@@ -101,7 +101,7 @@
         <w:rPr>
           <w:b w:val="0"/>
         </w:rPr>
-        <w:t>This project presents a machine learning based recruitment fraud detection system for online job portals. The system preprocesses job advertisement text, transforms it using TF-IDF, and evaluates multiple classification models including Logistic Regression, Naive Bayes, Support Vector Machine, and Random Forest. The selected model is integrated into a Flask web application that supports authenticated users, administrative monitoring, and prediction logging. The system aims to reduce the risk of online recruitment scams and improve trust in digital hiring environments.</w:t>
+        <w:t>This project presents a machine learning based recruitment fraud detection system for online job portals. The system preprocesses job advertisement text, transforms it using TF-IDF, and evaluates multiple classification models including Logistic Regression, Naive Bayes, Support Vector Machine, and Random Forest. The selected model is integrated into a Flask web application that supports shared authentication, role-based access, responsive multi-page navigation, administrative monitoring, and prediction logging. The system aims to reduce the risk of online recruitment scams and improve trust in digital hiring environments.</w:t>
       </w:r>
     </w:p>
     <w:p/>
@@ -381,7 +381,7 @@
         <w:rPr>
           <w:b w:val="0"/>
         </w:rPr>
-        <w:t>This project focuses on English-language text classification for job advertisements. The implemented system covers dataset preprocessing, feature extraction with TF-IDF, machine learning model comparison, a Flask-based web application, authentication for users and administrators, and a dashboard for prediction monitoring.</w:t>
+        <w:t>This project focuses on English-language text classification for job advertisements. The implemented system covers dataset preprocessing, feature extraction with TF-IDF, machine learning model comparison, a Flask-based web application, shared sign-in with role-based access control, multi-page responsive interfaces, and an administrative dashboard for prediction monitoring.</w:t>
       </w:r>
     </w:p>
     <w:p>
@@ -413,7 +413,7 @@
         <w:pStyle w:val="ListBullet"/>
       </w:pPr>
       <w:r>
-        <w:t>Provide a user-facing web interface for text submission and prediction.</w:t>
+        <w:t>Provide a user-facing web interface with separate overview, prediction, and signals pages.</w:t>
       </w:r>
     </w:p>
     <w:p>
@@ -421,7 +421,15 @@
         <w:pStyle w:val="ListBullet"/>
       </w:pPr>
       <w:r>
-        <w:t>Provide an administrator dashboard for monitoring prediction activity.</w:t>
+        <w:t>Provide an administrator dashboard for monitoring prediction activity and stored results.</w:t>
+      </w:r>
+    </w:p>
+    <w:p>
+      <w:pPr>
+        <w:pStyle w:val="ListBullet"/>
+      </w:pPr>
+      <w:r>
+        <w:t>Provide responsive navigation that adapts from desktop top navigation to a mobile sidebar menu.</w:t>
       </w:r>
     </w:p>
     <w:p>
@@ -649,7 +657,7 @@
           </w:tcPr>
           <w:p>
             <w:r>
-              <w:t>HTML, Tailwind CSS, JavaScript, Chart.js</w:t>
+              <w:t>HTML, Tailwind CSS, JavaScript, Chart.js, responsive mobile sidebar UI</w:t>
             </w:r>
           </w:p>
         </w:tc>
@@ -1020,7 +1028,7 @@
           </w:tcPr>
           <w:p>
             <w:r>
-              <w:t>Prediction page and admin dashboard</w:t>
+              <w:t>Authentication, multi-page UI, prediction page, and admin dashboard</w:t>
             </w:r>
           </w:p>
         </w:tc>
@@ -1799,7 +1807,7 @@
         <w:pStyle w:val="ListBullet"/>
       </w:pPr>
       <w:r>
-        <w:t>The system shall allow users to sign up and sign in.</w:t>
+        <w:t>The system shall allow users and administrators to authenticate through a shared sign-in page.</w:t>
       </w:r>
     </w:p>
     <w:p>
@@ -1807,7 +1815,7 @@
         <w:pStyle w:val="ListBullet"/>
       </w:pPr>
       <w:r>
-        <w:t>The system shall allow administrators to sign up and sign in.</w:t>
+        <w:t>The system shall allow separate user sign-up and admin sign-up flows.</w:t>
       </w:r>
     </w:p>
     <w:p>
@@ -1839,7 +1847,23 @@
         <w:pStyle w:val="ListBullet"/>
       </w:pPr>
       <w:r>
-        <w:t>The system shall display dashboard statistics to administrators.</w:t>
+        <w:t>The system shall display overview, prediction, and signals pages to authenticated users.</w:t>
+      </w:r>
+    </w:p>
+    <w:p>
+      <w:pPr>
+        <w:pStyle w:val="ListBullet"/>
+      </w:pPr>
+      <w:r>
+        <w:t>The system shall display dashboard statistics to administrators only.</w:t>
+      </w:r>
+    </w:p>
+    <w:p>
+      <w:pPr>
+        <w:pStyle w:val="ListBullet"/>
+      </w:pPr>
+      <w:r>
+        <w:t>The system shall adapt navigation for desktop and mobile devices.</w:t>
       </w:r>
     </w:p>
     <w:p>
@@ -1899,7 +1923,29 @@
           </w:tcPr>
           <w:p>
             <w:r>
-              <w:t>User authentication for regular users and admins</w:t>
+              <w:t>Shared sign-in with role-based redirect for users and admins</w:t>
+            </w:r>
+          </w:p>
+        </w:tc>
+      </w:tr>
+      <w:tr>
+        <w:tc>
+          <w:tcPr>
+            <w:tcW w:type="dxa" w:w="4680"/>
+          </w:tcPr>
+          <w:p>
+            <w:r>
+              <w:t>Functional</w:t>
+            </w:r>
+          </w:p>
+        </w:tc>
+        <w:tc>
+          <w:tcPr>
+            <w:tcW w:type="dxa" w:w="4680"/>
+          </w:tcPr>
+          <w:p>
+            <w:r>
+              <w:t>Separate user sign-up and admin sign-up with admin code</w:t>
             </w:r>
           </w:p>
         </w:tc>
@@ -1955,6 +2001,28 @@
           </w:tcPr>
           <w:p>
             <w:r>
+              <w:t>Functional</w:t>
+            </w:r>
+          </w:p>
+        </w:tc>
+        <w:tc>
+          <w:tcPr>
+            <w:tcW w:type="dxa" w:w="4680"/>
+          </w:tcPr>
+          <w:p>
+            <w:r>
+              <w:t>Separate overview, predict, signals, and dashboard pages</w:t>
+            </w:r>
+          </w:p>
+        </w:tc>
+      </w:tr>
+      <w:tr>
+        <w:tc>
+          <w:tcPr>
+            <w:tcW w:type="dxa" w:w="4680"/>
+          </w:tcPr>
+          <w:p>
+            <w:r>
               <w:t>Non-functional</w:t>
             </w:r>
           </w:p>
@@ -1965,7 +2033,7 @@
           </w:tcPr>
           <w:p>
             <w:r>
-              <w:t>Usable web interface for project demonstration</w:t>
+              <w:t>Responsive Tailwind CSS interface for mobile and desktop</w:t>
             </w:r>
           </w:p>
         </w:tc>
@@ -2406,7 +2474,7 @@
           </w:tcPr>
           <w:p>
             <w:r>
-              <w:t>User sign in / sign up</w:t>
+              <w:t>Shared sign-in page</w:t>
             </w:r>
           </w:p>
         </w:tc>
@@ -2416,7 +2484,39 @@
           </w:tcPr>
           <w:p>
             <w:r>
-              <w:t>Authentication for standard users</w:t>
+              <w:t>Authenticate both users and admins</w:t>
+            </w:r>
+          </w:p>
+        </w:tc>
+        <w:tc>
+          <w:tcPr>
+            <w:tcW w:type="dxa" w:w="3120"/>
+          </w:tcPr>
+          <w:p>
+            <w:r>
+              <w:t>Email, password, role-based redirect</w:t>
+            </w:r>
+          </w:p>
+        </w:tc>
+      </w:tr>
+      <w:tr>
+        <w:tc>
+          <w:tcPr>
+            <w:tcW w:type="dxa" w:w="3120"/>
+          </w:tcPr>
+          <w:p>
+            <w:r>
+              <w:t>User sign-up page</w:t>
+            </w:r>
+          </w:p>
+        </w:tc>
+        <w:tc>
+          <w:tcPr>
+            <w:tcW w:type="dxa" w:w="3120"/>
+          </w:tcPr>
+          <w:p>
+            <w:r>
+              <w:t>Create standard user accounts</w:t>
             </w:r>
           </w:p>
         </w:tc>
@@ -2438,7 +2538,7 @@
           </w:tcPr>
           <w:p>
             <w:r>
-              <w:t>Admin sign in / sign up</w:t>
+              <w:t>Admin sign-up page</w:t>
             </w:r>
           </w:p>
         </w:tc>
@@ -2448,7 +2548,7 @@
           </w:tcPr>
           <w:p>
             <w:r>
-              <w:t>Authentication for admins</w:t>
+              <w:t>Create admin accounts</w:t>
             </w:r>
           </w:p>
         </w:tc>
@@ -2459,6 +2559,38 @@
           <w:p>
             <w:r>
               <w:t>Name, email, password, admin code</w:t>
+            </w:r>
+          </w:p>
+        </w:tc>
+      </w:tr>
+      <w:tr>
+        <w:tc>
+          <w:tcPr>
+            <w:tcW w:type="dxa" w:w="3120"/>
+          </w:tcPr>
+          <w:p>
+            <w:r>
+              <w:t>Overview page</w:t>
+            </w:r>
+          </w:p>
+        </w:tc>
+        <w:tc>
+          <w:tcPr>
+            <w:tcW w:type="dxa" w:w="3120"/>
+          </w:tcPr>
+          <w:p>
+            <w:r>
+              <w:t>Summarize system purpose and quick metrics</w:t>
+            </w:r>
+          </w:p>
+        </w:tc>
+        <w:tc>
+          <w:tcPr>
+            <w:tcW w:type="dxa" w:w="3120"/>
+          </w:tcPr>
+          <w:p>
+            <w:r>
+              <w:t>Stat cards, process summary, navigation</w:t>
             </w:r>
           </w:p>
         </w:tc>
@@ -2491,6 +2623,38 @@
           <w:p>
             <w:r>
               <w:t>Textarea, sample inputs, result card</w:t>
+            </w:r>
+          </w:p>
+        </w:tc>
+      </w:tr>
+      <w:tr>
+        <w:tc>
+          <w:tcPr>
+            <w:tcW w:type="dxa" w:w="3120"/>
+          </w:tcPr>
+          <w:p>
+            <w:r>
+              <w:t>Signals page</w:t>
+            </w:r>
+          </w:p>
+        </w:tc>
+        <w:tc>
+          <w:tcPr>
+            <w:tcW w:type="dxa" w:w="3120"/>
+          </w:tcPr>
+          <w:p>
+            <w:r>
+              <w:t>Explain fraud and legitimate indicators</w:t>
+            </w:r>
+          </w:p>
+        </w:tc>
+        <w:tc>
+          <w:tcPr>
+            <w:tcW w:type="dxa" w:w="3120"/>
+          </w:tcPr>
+          <w:p>
+            <w:r>
+              <w:t>Reference cards and guidance text</w:t>
             </w:r>
           </w:p>
         </w:tc>
@@ -2911,7 +3075,7 @@
         <w:br/>
         <w:t xml:space="preserve">            flash("Please sign in as admin first.", "error")</w:t>
         <w:br/>
-        <w:t xml:space="preserve">            return redirect(url_for("admin_signin"))</w:t>
+        <w:t xml:space="preserve">            return redirect(url_for("user_signin"))</w:t>
         <w:br/>
         <w:t xml:space="preserve">        if g.current_user["role"] != "admin":</w:t>
         <w:br/>
@@ -2979,7 +3143,7 @@
         <w:br/>
         <w:t xml:space="preserve">    try:</w:t>
         <w:br/>
-        <w:t xml:space="preserve">        predictor = PredictionService(model_dir=Pa</w:t>
+        <w:t xml:space="preserve">        predictor = PredictionService(model_dir=Pat</w:t>
       </w:r>
     </w:p>
     <w:p>

</xml_diff>